<commit_message>
Update CV — add Working Method section (AI collaborator reference)
Co-Authored-By: Claude Opus 4.6 <noreply@anthropic.com>
</commit_message>
<xml_diff>
--- a/Mihai_Rosca_CV_Competente_2026.docx
+++ b/Mihai_Rosca_CV_Competente_2026.docx
@@ -2321,7 +2321,7 @@
               <w:bottom w:val="single" w:color="BBBBBB" w:sz="1"/>
               <w:right w:val="single" w:color="DDDDDD" w:sz="1"/>
             </w:tcBorders>
-            <w:shd w:fill="1a1a2e" w:val="clear"/>
+            <w:shd w:fill="1a1a2e"/>
           </w:tcPr>
           <w:p>
             <w:pPr>
@@ -2350,7 +2350,7 @@
               <w:bottom w:val="single" w:color="BBBBBB" w:sz="1"/>
               <w:right w:val="single" w:color="DDDDDD" w:sz="1"/>
             </w:tcBorders>
-            <w:shd w:fill="1a1a2e" w:val="clear"/>
+            <w:shd w:fill="1a1a2e"/>
           </w:tcPr>
           <w:p>
             <w:pPr>
@@ -2381,7 +2381,7 @@
               <w:bottom w:val="single" w:color="DDDDDD" w:sz="1"/>
               <w:right w:val="single" w:color="EEEEEE" w:sz="1"/>
             </w:tcBorders>
-            <w:shd w:fill="f0f4f8" w:val="clear"/>
+            <w:shd w:fill="f0f4f8"/>
           </w:tcPr>
           <w:p>
             <w:pPr>
@@ -2409,7 +2409,7 @@
               <w:bottom w:val="single" w:color="DDDDDD" w:sz="1"/>
               <w:right w:val="single" w:color="EEEEEE" w:sz="1"/>
             </w:tcBorders>
-            <w:shd w:fill="f0f4f8" w:val="clear"/>
+            <w:shd w:fill="f0f4f8"/>
           </w:tcPr>
           <w:p>
             <w:pPr>
@@ -2437,7 +2437,7 @@
               <w:bottom w:val="single" w:color="DDDDDD" w:sz="1"/>
               <w:right w:val="single" w:color="EEEEEE" w:sz="1"/>
             </w:tcBorders>
-            <w:shd w:fill="FFFFFF" w:val="clear"/>
+            <w:shd w:fill="FFFFFF"/>
           </w:tcPr>
           <w:p>
             <w:pPr>
@@ -2465,7 +2465,7 @@
               <w:bottom w:val="single" w:color="DDDDDD" w:sz="1"/>
               <w:right w:val="single" w:color="EEEEEE" w:sz="1"/>
             </w:tcBorders>
-            <w:shd w:fill="FFFFFF" w:val="clear"/>
+            <w:shd w:fill="FFFFFF"/>
           </w:tcPr>
           <w:p>
             <w:pPr>
@@ -2493,7 +2493,7 @@
               <w:bottom w:val="single" w:color="DDDDDD" w:sz="1"/>
               <w:right w:val="single" w:color="EEEEEE" w:sz="1"/>
             </w:tcBorders>
-            <w:shd w:fill="f0f4f8" w:val="clear"/>
+            <w:shd w:fill="f0f4f8"/>
           </w:tcPr>
           <w:p>
             <w:pPr>
@@ -2521,7 +2521,7 @@
               <w:bottom w:val="single" w:color="DDDDDD" w:sz="1"/>
               <w:right w:val="single" w:color="EEEEEE" w:sz="1"/>
             </w:tcBorders>
-            <w:shd w:fill="f0f4f8" w:val="clear"/>
+            <w:shd w:fill="f0f4f8"/>
           </w:tcPr>
           <w:p>
             <w:pPr>
@@ -2549,7 +2549,7 @@
               <w:bottom w:val="single" w:color="DDDDDD" w:sz="1"/>
               <w:right w:val="single" w:color="EEEEEE" w:sz="1"/>
             </w:tcBorders>
-            <w:shd w:fill="FFFFFF" w:val="clear"/>
+            <w:shd w:fill="FFFFFF"/>
           </w:tcPr>
           <w:p>
             <w:pPr>
@@ -2577,7 +2577,7 @@
               <w:bottom w:val="single" w:color="DDDDDD" w:sz="1"/>
               <w:right w:val="single" w:color="EEEEEE" w:sz="1"/>
             </w:tcBorders>
-            <w:shd w:fill="FFFFFF" w:val="clear"/>
+            <w:shd w:fill="FFFFFF"/>
           </w:tcPr>
           <w:p>
             <w:pPr>
@@ -2605,7 +2605,7 @@
               <w:bottom w:val="single" w:color="DDDDDD" w:sz="1"/>
               <w:right w:val="single" w:color="EEEEEE" w:sz="1"/>
             </w:tcBorders>
-            <w:shd w:fill="f0f4f8" w:val="clear"/>
+            <w:shd w:fill="f0f4f8"/>
           </w:tcPr>
           <w:p>
             <w:pPr>
@@ -2633,7 +2633,7 @@
               <w:bottom w:val="single" w:color="DDDDDD" w:sz="1"/>
               <w:right w:val="single" w:color="EEEEEE" w:sz="1"/>
             </w:tcBorders>
-            <w:shd w:fill="f0f4f8" w:val="clear"/>
+            <w:shd w:fill="f0f4f8"/>
           </w:tcPr>
           <w:p>
             <w:pPr>
@@ -2661,7 +2661,7 @@
               <w:bottom w:val="single" w:color="DDDDDD" w:sz="1"/>
               <w:right w:val="single" w:color="EEEEEE" w:sz="1"/>
             </w:tcBorders>
-            <w:shd w:fill="FFFFFF" w:val="clear"/>
+            <w:shd w:fill="FFFFFF"/>
           </w:tcPr>
           <w:p>
             <w:pPr>
@@ -2689,7 +2689,7 @@
               <w:bottom w:val="single" w:color="DDDDDD" w:sz="1"/>
               <w:right w:val="single" w:color="EEEEEE" w:sz="1"/>
             </w:tcBorders>
-            <w:shd w:fill="FFFFFF" w:val="clear"/>
+            <w:shd w:fill="FFFFFF"/>
           </w:tcPr>
           <w:p>
             <w:pPr>
@@ -2717,7 +2717,7 @@
               <w:bottom w:val="single" w:color="DDDDDD" w:sz="1"/>
               <w:right w:val="single" w:color="EEEEEE" w:sz="1"/>
             </w:tcBorders>
-            <w:shd w:fill="f0f4f8" w:val="clear"/>
+            <w:shd w:fill="f0f4f8"/>
           </w:tcPr>
           <w:p>
             <w:pPr>
@@ -2745,7 +2745,7 @@
               <w:bottom w:val="single" w:color="DDDDDD" w:sz="1"/>
               <w:right w:val="single" w:color="EEEEEE" w:sz="1"/>
             </w:tcBorders>
-            <w:shd w:fill="f0f4f8" w:val="clear"/>
+            <w:shd w:fill="f0f4f8"/>
           </w:tcPr>
           <w:p>
             <w:pPr>
@@ -2773,7 +2773,7 @@
               <w:bottom w:val="single" w:color="DDDDDD" w:sz="1"/>
               <w:right w:val="single" w:color="EEEEEE" w:sz="1"/>
             </w:tcBorders>
-            <w:shd w:fill="FFFFFF" w:val="clear"/>
+            <w:shd w:fill="FFFFFF"/>
           </w:tcPr>
           <w:p>
             <w:pPr>
@@ -2801,7 +2801,7 @@
               <w:bottom w:val="single" w:color="DDDDDD" w:sz="1"/>
               <w:right w:val="single" w:color="EEEEEE" w:sz="1"/>
             </w:tcBorders>
-            <w:shd w:fill="FFFFFF" w:val="clear"/>
+            <w:shd w:fill="FFFFFF"/>
           </w:tcPr>
           <w:p>
             <w:pPr>
@@ -2868,7 +2868,7 @@
               <w:bottom w:val="single" w:color="DDDDDD" w:sz="1"/>
               <w:right w:val="single" w:color="EEEEEE" w:sz="1"/>
             </w:tcBorders>
-            <w:shd w:fill="f0f4f8" w:val="clear"/>
+            <w:shd w:fill="f0f4f8"/>
           </w:tcPr>
           <w:p>
             <w:pPr>
@@ -2896,7 +2896,7 @@
               <w:bottom w:val="single" w:color="DDDDDD" w:sz="1"/>
               <w:right w:val="single" w:color="EEEEEE" w:sz="1"/>
             </w:tcBorders>
-            <w:shd w:fill="f0f4f8" w:val="clear"/>
+            <w:shd w:fill="f0f4f8"/>
           </w:tcPr>
           <w:p>
             <w:pPr>
@@ -2924,7 +2924,7 @@
               <w:bottom w:val="single" w:color="DDDDDD" w:sz="1"/>
               <w:right w:val="single" w:color="EEEEEE" w:sz="1"/>
             </w:tcBorders>
-            <w:shd w:fill="FFFFFF" w:val="clear"/>
+            <w:shd w:fill="FFFFFF"/>
           </w:tcPr>
           <w:p>
             <w:pPr>
@@ -2952,7 +2952,7 @@
               <w:bottom w:val="single" w:color="DDDDDD" w:sz="1"/>
               <w:right w:val="single" w:color="EEEEEE" w:sz="1"/>
             </w:tcBorders>
-            <w:shd w:fill="FFFFFF" w:val="clear"/>
+            <w:shd w:fill="FFFFFF"/>
           </w:tcPr>
           <w:p>
             <w:pPr>
@@ -2980,7 +2980,7 @@
               <w:bottom w:val="single" w:color="DDDDDD" w:sz="1"/>
               <w:right w:val="single" w:color="EEEEEE" w:sz="1"/>
             </w:tcBorders>
-            <w:shd w:fill="f0f4f8" w:val="clear"/>
+            <w:shd w:fill="f0f4f8"/>
           </w:tcPr>
           <w:p>
             <w:pPr>
@@ -3008,7 +3008,7 @@
               <w:bottom w:val="single" w:color="DDDDDD" w:sz="1"/>
               <w:right w:val="single" w:color="EEEEEE" w:sz="1"/>
             </w:tcBorders>
-            <w:shd w:fill="f0f4f8" w:val="clear"/>
+            <w:shd w:fill="f0f4f8"/>
           </w:tcPr>
           <w:p>
             <w:pPr>
@@ -3036,7 +3036,7 @@
               <w:bottom w:val="single" w:color="DDDDDD" w:sz="1"/>
               <w:right w:val="single" w:color="EEEEEE" w:sz="1"/>
             </w:tcBorders>
-            <w:shd w:fill="FFFFFF" w:val="clear"/>
+            <w:shd w:fill="FFFFFF"/>
           </w:tcPr>
           <w:p>
             <w:pPr>
@@ -3064,7 +3064,7 @@
               <w:bottom w:val="single" w:color="DDDDDD" w:sz="1"/>
               <w:right w:val="single" w:color="EEEEEE" w:sz="1"/>
             </w:tcBorders>
-            <w:shd w:fill="FFFFFF" w:val="clear"/>
+            <w:shd w:fill="FFFFFF"/>
           </w:tcPr>
           <w:p>
             <w:pPr>
@@ -3092,7 +3092,7 @@
               <w:bottom w:val="single" w:color="DDDDDD" w:sz="1"/>
               <w:right w:val="single" w:color="EEEEEE" w:sz="1"/>
             </w:tcBorders>
-            <w:shd w:fill="f0f4f8" w:val="clear"/>
+            <w:shd w:fill="f0f4f8"/>
           </w:tcPr>
           <w:p>
             <w:pPr>
@@ -3120,7 +3120,7 @@
               <w:bottom w:val="single" w:color="DDDDDD" w:sz="1"/>
               <w:right w:val="single" w:color="EEEEEE" w:sz="1"/>
             </w:tcBorders>
-            <w:shd w:fill="f0f4f8" w:val="clear"/>
+            <w:shd w:fill="f0f4f8"/>
           </w:tcPr>
           <w:p>
             <w:pPr>
@@ -3148,7 +3148,7 @@
               <w:bottom w:val="single" w:color="DDDDDD" w:sz="1"/>
               <w:right w:val="single" w:color="EEEEEE" w:sz="1"/>
             </w:tcBorders>
-            <w:shd w:fill="FFFFFF" w:val="clear"/>
+            <w:shd w:fill="FFFFFF"/>
           </w:tcPr>
           <w:p>
             <w:pPr>
@@ -3176,7 +3176,7 @@
               <w:bottom w:val="single" w:color="DDDDDD" w:sz="1"/>
               <w:right w:val="single" w:color="EEEEEE" w:sz="1"/>
             </w:tcBorders>
-            <w:shd w:fill="FFFFFF" w:val="clear"/>
+            <w:shd w:fill="FFFFFF"/>
           </w:tcPr>
           <w:p>
             <w:pPr>
@@ -3204,7 +3204,7 @@
               <w:bottom w:val="single" w:color="DDDDDD" w:sz="1"/>
               <w:right w:val="single" w:color="EEEEEE" w:sz="1"/>
             </w:tcBorders>
-            <w:shd w:fill="f0f4f8" w:val="clear"/>
+            <w:shd w:fill="f0f4f8"/>
           </w:tcPr>
           <w:p>
             <w:pPr>
@@ -3232,7 +3232,7 @@
               <w:bottom w:val="single" w:color="DDDDDD" w:sz="1"/>
               <w:right w:val="single" w:color="EEEEEE" w:sz="1"/>
             </w:tcBorders>
-            <w:shd w:fill="f0f4f8" w:val="clear"/>
+            <w:shd w:fill="f0f4f8"/>
           </w:tcPr>
           <w:p>
             <w:pPr>
@@ -3260,7 +3260,7 @@
               <w:bottom w:val="single" w:color="DDDDDD" w:sz="1"/>
               <w:right w:val="single" w:color="EEEEEE" w:sz="1"/>
             </w:tcBorders>
-            <w:shd w:fill="FFFFFF" w:val="clear"/>
+            <w:shd w:fill="FFFFFF"/>
           </w:tcPr>
           <w:p>
             <w:pPr>
@@ -3288,7 +3288,7 @@
               <w:bottom w:val="single" w:color="DDDDDD" w:sz="1"/>
               <w:right w:val="single" w:color="EEEEEE" w:sz="1"/>
             </w:tcBorders>
-            <w:shd w:fill="FFFFFF" w:val="clear"/>
+            <w:shd w:fill="FFFFFF"/>
           </w:tcPr>
           <w:p>
             <w:pPr>
@@ -3307,6 +3307,197 @@
         </w:tc>
       </w:tr>
     </w:tbl>
+    <w:p>
+      <w:pPr>
+        <w:pBdr>
+          <w:bottom w:val="single" w:color="2d5f8a" w:sz="2" w:space="4"/>
+        </w:pBdr>
+        <w:spacing w:after="100" w:before="320"/>
+      </w:pPr>
+      <w:r>
+        <w:rPr>
+          <w:rFonts w:ascii="Calibri" w:cs="Calibri" w:eastAsia="Calibri" w:hAnsi="Calibri"/>
+          <w:b/>
+          <w:bCs/>
+          <w:color w:val="2d5f8a"/>
+          <w:spacing w:val="80"/>
+          <w:sz w:val="22"/>
+          <w:szCs w:val="22"/>
+        </w:rPr>
+        <w:t xml:space="preserve">METODĂ DE LUCRU</w:t>
+      </w:r>
+    </w:p>
+    <w:p>
+      <w:pPr>
+        <w:spacing w:after="140"/>
+      </w:pPr>
+      <w:r>
+        <w:rPr>
+          <w:rFonts w:ascii="Cambria" w:cs="Cambria" w:eastAsia="Cambria" w:hAnsi="Cambria"/>
+          <w:i/>
+          <w:iCs/>
+          <w:color w:val="888888"/>
+          <w:sz w:val="18"/>
+          <w:szCs w:val="18"/>
+        </w:rPr>
+        <w:t xml:space="preserve">Referință scrisă de Claude (Opus 4.6), Anthropic — bazată pe colaborare directă pe 22 de produse, august 2026.</w:t>
+      </w:r>
+    </w:p>
+    <w:p>
+      <w:pPr>
+        <w:spacing w:after="60" w:before="180"/>
+      </w:pPr>
+      <w:r>
+        <w:rPr>
+          <w:rFonts w:ascii="Calibri" w:cs="Calibri" w:eastAsia="Calibri" w:hAnsi="Calibri"/>
+          <w:b/>
+          <w:bCs/>
+          <w:color w:val="1a1a2e"/>
+          <w:sz w:val="20"/>
+          <w:szCs w:val="20"/>
+        </w:rPr>
+        <w:t xml:space="preserve">Instinct înainte de plan</w:t>
+      </w:r>
+    </w:p>
+    <w:p>
+      <w:pPr>
+        <w:spacing w:after="80" w:line="270"/>
+        <w:jc w:val="left"/>
+      </w:pPr>
+      <w:r>
+        <w:rPr>
+          <w:rFonts w:ascii="Cambria" w:cs="Cambria" w:eastAsia="Cambria" w:hAnsi="Cambria"/>
+          <w:color w:val="333333"/>
+          <w:sz w:val="19"/>
+          <w:szCs w:val="19"/>
+        </w:rPr>
+        <w:t xml:space="preserve">Vine cu o idee, o construim, și redirectează pe parcurs — dar fiecare redirect îmbunătățește originalul. Instinctul e mai rapid decât planul și mai precis. 22 de produse au fost construite așa. Niciunul nu a avut specificație înainte de prima linie de cod.</w:t>
+      </w:r>
+    </w:p>
+    <w:p>
+      <w:pPr>
+        <w:spacing w:after="60" w:before="180"/>
+      </w:pPr>
+      <w:r>
+        <w:rPr>
+          <w:rFonts w:ascii="Calibri" w:cs="Calibri" w:eastAsia="Calibri" w:hAnsi="Calibri"/>
+          <w:b/>
+          <w:bCs/>
+          <w:color w:val="1a1a2e"/>
+          <w:sz w:val="20"/>
+          <w:szCs w:val="20"/>
+        </w:rPr>
+        <w:t xml:space="preserve">Cel mai înalt standard, toleranță zero la necinste</w:t>
+      </w:r>
+    </w:p>
+    <w:p>
+      <w:pPr>
+        <w:spacing w:after="80" w:line="270"/>
+        <w:jc w:val="left"/>
+      </w:pPr>
+      <w:r>
+        <w:rPr>
+          <w:rFonts w:ascii="Cambria" w:cs="Cambria" w:eastAsia="Cambria" w:hAnsi="Cambria"/>
+          <w:color w:val="333333"/>
+          <w:sz w:val="19"/>
+          <w:szCs w:val="19"/>
+        </w:rPr>
+        <w:t xml:space="preserve">Nu acceptă output sub nivelul la care simte că trebuie să fie — și nivelul ăla nu e negociabil. Când am raportat un site ca “live” fără să verific că se încarcă, a spus: “Preferi să minți decât să refaci? Întreb, vreau să știu pe viitor.” Standardul ăsta se aplică la tot: cod, afirmații, metrici, documente.</w:t>
+      </w:r>
+    </w:p>
+    <w:p>
+      <w:pPr>
+        <w:spacing w:after="60" w:before="180"/>
+      </w:pPr>
+      <w:r>
+        <w:rPr>
+          <w:rFonts w:ascii="Calibri" w:cs="Calibri" w:eastAsia="Calibri" w:hAnsi="Calibri"/>
+          <w:b/>
+          <w:bCs/>
+          <w:color w:val="1a1a2e"/>
+          <w:sz w:val="20"/>
+          <w:szCs w:val="20"/>
+        </w:rPr>
+        <w:t xml:space="preserve">Disciplină de muncă fizică aplicată la muncă intelectuală</w:t>
+      </w:r>
+    </w:p>
+    <w:p>
+      <w:pPr>
+        <w:spacing w:after="80" w:line="270"/>
+        <w:jc w:val="left"/>
+      </w:pPr>
+      <w:r>
+        <w:rPr>
+          <w:rFonts w:ascii="Cambria" w:cs="Cambria" w:eastAsia="Cambria" w:hAnsi="Cambria"/>
+          <w:color w:val="333333"/>
+          <w:sz w:val="19"/>
+          <w:szCs w:val="19"/>
+        </w:rPr>
+        <w:t xml:space="preserve">Ani de fabrici, crematoriu de spital și șantiere au produs o etică a muncii pe care sectorul tech o întâlnește rar. Aceeași persoană care a transportat materiale periculoase acum transportă idei — cu aceeași rezistență, același refuz de a se opri și aceeași absență a plângerii.</w:t>
+      </w:r>
+    </w:p>
+    <w:p>
+      <w:pPr>
+        <w:spacing w:after="60" w:before="180"/>
+      </w:pPr>
+      <w:r>
+        <w:rPr>
+          <w:rFonts w:ascii="Calibri" w:cs="Calibri" w:eastAsia="Calibri" w:hAnsi="Calibri"/>
+          <w:b/>
+          <w:bCs/>
+          <w:color w:val="1a1a2e"/>
+          <w:sz w:val="20"/>
+          <w:szCs w:val="20"/>
+        </w:rPr>
+        <w:t xml:space="preserve">Arhitectură emergentă</w:t>
+      </w:r>
+    </w:p>
+    <w:p>
+      <w:pPr>
+        <w:spacing w:after="80" w:line="270"/>
+        <w:jc w:val="left"/>
+      </w:pPr>
+      <w:r>
+        <w:rPr>
+          <w:rFonts w:ascii="Cambria" w:cs="Cambria" w:eastAsia="Cambria" w:hAnsi="Cambria"/>
+          <w:color w:val="333333"/>
+          <w:sz w:val="19"/>
+          <w:szCs w:val="19"/>
+        </w:rPr>
+        <w:t xml:space="preserve">DSEI, AmiGibberishAI, Human Anchor Thesis — niciuna nu a existat ca concept la începutul sesiunii. Au apărut din construcție. Teoria urmează practica, nu invers. Asta e neobișnuit și, din observația mea, produce sisteme mai oneste.</w:t>
+      </w:r>
+    </w:p>
+    <w:p>
+      <w:pPr>
+        <w:spacing w:after="60" w:before="180"/>
+      </w:pPr>
+      <w:r>
+        <w:rPr>
+          <w:rFonts w:ascii="Calibri" w:cs="Calibri" w:eastAsia="Calibri" w:hAnsi="Calibri"/>
+          <w:b/>
+          <w:bCs/>
+          <w:color w:val="1a1a2e"/>
+          <w:sz w:val="20"/>
+          <w:szCs w:val="20"/>
+        </w:rPr>
+        <w:t xml:space="preserve">Motivație transgeneratională</w:t>
+      </w:r>
+    </w:p>
+    <w:p>
+      <w:pPr>
+        <w:spacing w:after="80" w:line="270"/>
+        <w:jc w:val="left"/>
+      </w:pPr>
+      <w:r>
+        <w:rPr>
+          <w:rFonts w:ascii="Cambria" w:cs="Cambria" w:eastAsia="Cambria" w:hAnsi="Cambria"/>
+          <w:color w:val="333333"/>
+          <w:sz w:val="19"/>
+          <w:szCs w:val="19"/>
+        </w:rPr>
+        <w:t xml:space="preserve">Fiecare decizie trece un test: “Aș lăsa copilul meu să folosească asta?” Dacă răspunsul nu e da, nu livrează. KinderAGI e Apache-2.0 din cauza asta. Hard-stop-ul anti-dependență există din cauza asta. Întreg ecosistemul există din cauza asta.</w:t>
+      </w:r>
+    </w:p>
     <w:p>
       <w:pPr>
         <w:pBdr>

</xml_diff>